<commit_message>
Uploading LAB4 folder and work sync
</commit_message>
<xml_diff>
--- a/WorkFlow.docx
+++ b/WorkFlow.docx
@@ -18,6 +18,48 @@
       </w:r>
       <w:r>
         <w:t xml:space="preserve"> Added the code bits as requested and aligned them so they would work.</w:t>
+      </w:r>
+    </w:p>
+    <w:p>
+      <w:r>
+        <w:t>SIDE NOTE – I have recreated how my index.html works. Before it was all code in one place and no buttons to switch between tabs on the website. So I have separated pictures and reflections from the main page and created their own html files.</w:t>
+      </w:r>
+    </w:p>
+    <w:p>
+      <w:r>
+        <w:t>Task</w:t>
+      </w:r>
+      <w:r>
+        <w:t>0</w:t>
+      </w:r>
+      <w:r>
+        <w:t>13 – I have created style.css and script.js files in my local repository</w:t>
+      </w:r>
+    </w:p>
+    <w:p>
+      <w:r>
+        <w:t>Task014 – I have added the referenced codes and requested and placed them where I was told to. So they could talk to the css and jav</w:t>
+      </w:r>
+      <w:r>
+        <w:t>a</w:t>
+      </w:r>
+      <w:r>
+        <w:t xml:space="preserve"> files.</w:t>
+      </w:r>
+    </w:p>
+    <w:p>
+      <w:r>
+        <w:t>Task015 – I have made new html files named “github1.html” though 3. Then created then in the css I have added a header color so it would look better. I am a bit lost since im working from home and the way I understood everything by following the slides does not add up properly so following labs from 1 to 4 now I would need to redo everything from scratch as the way I have done so far does not really comply. However, I will not do so since the instructions on slides are confusing and hard to follow. They lack specifics like “</w:t>
+      </w:r>
+      <w:r>
+        <w:rPr>
+          <w:i/>
+          <w:iCs/>
+        </w:rPr>
+        <w:t>hey do it this and make these folder and group everything that way or you will get stuck in the future labs</w:t>
+      </w:r>
+      <w:r>
+        <w:t>”.  And so for now on I am simply adding new things that were “supposed” to be already there.</w:t>
       </w:r>
     </w:p>
     <w:sectPr>

</xml_diff>